<commit_message>
Refactored 'RecordingIsPosted' elements to more generalized 'MandrillNotification*' naming scheme. DES subscription is generated and confirmed. RSS for CalendarRSSFull is refined. Stubs in new handler for 'Incoming from Mandrill'
</commit_message>
<xml_diff>
--- a/CUWebinars.Web/App_Data/mergeTemplates/RecordingIsPostedToExistingUserBW.docx
+++ b/CUWebinars.Web/App_Data/mergeTemplates/RecordingIsPostedToExistingUserBW.docx
@@ -18,8 +18,8 @@
       </w:tblPr>
       <w:tblGrid>
         <w:gridCol w:w="265"/>
-        <w:gridCol w:w="6305"/>
-        <w:gridCol w:w="2516"/>
+        <w:gridCol w:w="5675"/>
+        <w:gridCol w:w="3146"/>
         <w:gridCol w:w="265"/>
       </w:tblGrid>
       <w:tr>
@@ -47,6 +47,9 @@
         </w:tc>
       </w:tr>
       <w:tr>
+        <w:trPr>
+          <w:trHeight w:val="1160"/>
+        </w:trPr>
         <w:tc>
           <w:tcPr>
             <w:tcW w:w="265" w:type="dxa"/>
@@ -59,7 +62,7 @@
         </w:tc>
         <w:tc>
           <w:tcPr>
-            <w:tcW w:w="6305" w:type="dxa"/>
+            <w:tcW w:w="5675" w:type="dxa"/>
             <w:tcBorders>
               <w:top w:val="single" w:sz="4" w:space="0" w:color="000000"/>
               <w:left w:val="single" w:sz="4" w:space="0" w:color="000000"/>
@@ -118,12 +121,19 @@
                 </wp:inline>
               </w:drawing>
             </w:r>
+            <w:r>
+              <w:rPr>
+                <w:noProof/>
+                <w:color w:val="4B5966"/>
+                <w:shd w:val="clear" w:color="auto" w:fill="4B5966"/>
+              </w:rPr>
+              <w:t>|</w:t>
+            </w:r>
           </w:p>
-          <w:p/>
         </w:tc>
         <w:tc>
           <w:tcPr>
-            <w:tcW w:w="2516" w:type="dxa"/>
+            <w:tcW w:w="3146" w:type="dxa"/>
             <w:tcBorders>
               <w:top w:val="single" w:sz="4" w:space="0" w:color="000000"/>
               <w:right w:val="single" w:sz="4" w:space="0" w:color="000000"/>
@@ -138,125 +148,287 @@
                 <w:szCs w:val="18"/>
               </w:rPr>
             </w:pPr>
-            <w:r>
-              <w:rPr>
-                <w:color w:val="7F7F7F" w:themeColor="text1" w:themeTint="80"/>
-                <w:sz w:val="18"/>
-                <w:szCs w:val="18"/>
-              </w:rPr>
-              <w:t xml:space="preserve">Order ID: </w:t>
-            </w:r>
           </w:p>
+          <w:tbl>
+            <w:tblPr>
+              <w:tblStyle w:val="TableGrid"/>
+              <w:tblW w:w="0" w:type="auto"/>
+              <w:tblBorders>
+                <w:top w:val="none" w:sz="0" w:space="0" w:color="auto"/>
+                <w:left w:val="none" w:sz="0" w:space="0" w:color="auto"/>
+                <w:bottom w:val="none" w:sz="0" w:space="0" w:color="auto"/>
+                <w:right w:val="none" w:sz="0" w:space="0" w:color="auto"/>
+                <w:insideH w:val="none" w:sz="0" w:space="0" w:color="auto"/>
+                <w:insideV w:val="none" w:sz="0" w:space="0" w:color="auto"/>
+              </w:tblBorders>
+              <w:tblLook w:val="04A0" w:firstRow="1" w:lastRow="0" w:firstColumn="1" w:lastColumn="0" w:noHBand="0" w:noVBand="1"/>
+            </w:tblPr>
+            <w:tblGrid>
+              <w:gridCol w:w="1373"/>
+              <w:gridCol w:w="1557"/>
+            </w:tblGrid>
+            <w:tr>
+              <w:tc>
+                <w:tcPr>
+                  <w:tcW w:w="1373" w:type="dxa"/>
+                </w:tcPr>
+                <w:p>
+                  <w:pPr>
+                    <w:pStyle w:val="NoSpacing"/>
+                    <w:jc w:val="right"/>
+                    <w:rPr>
+                      <w:noProof/>
+                      <w:color w:val="7F7F7F" w:themeColor="text1" w:themeTint="80"/>
+                      <w:sz w:val="18"/>
+                      <w:szCs w:val="18"/>
+                    </w:rPr>
+                  </w:pPr>
+                  <w:r>
+                    <w:rPr>
+                      <w:color w:val="7F7F7F" w:themeColor="text1" w:themeTint="80"/>
+                      <w:sz w:val="18"/>
+                      <w:szCs w:val="18"/>
+                    </w:rPr>
+                    <w:t>Or</w:t>
+                  </w:r>
+                  <w:bookmarkStart w:id="0" w:name="_GoBack"/>
+                  <w:bookmarkEnd w:id="0"/>
+                  <w:r>
+                    <w:rPr>
+                      <w:color w:val="7F7F7F" w:themeColor="text1" w:themeTint="80"/>
+                      <w:sz w:val="18"/>
+                      <w:szCs w:val="18"/>
+                    </w:rPr>
+                    <w:t>der ID:</w:t>
+                  </w:r>
+                </w:p>
+              </w:tc>
+              <w:tc>
+                <w:tcPr>
+                  <w:tcW w:w="1557" w:type="dxa"/>
+                </w:tcPr>
+                <w:p>
+                  <w:pPr>
+                    <w:pStyle w:val="NoSpacing"/>
+                    <w:rPr>
+                      <w:noProof/>
+                      <w:sz w:val="18"/>
+                      <w:szCs w:val="18"/>
+                    </w:rPr>
+                  </w:pPr>
+                  <w:r>
+                    <w:rPr>
+                      <w:sz w:val="18"/>
+                      <w:szCs w:val="18"/>
+                    </w:rPr>
+                    <w:fldChar w:fldCharType="begin"/>
+                  </w:r>
+                  <w:r>
+                    <w:rPr>
+                      <w:sz w:val="18"/>
+                      <w:szCs w:val="18"/>
+                    </w:rPr>
+                    <w:instrText xml:space="preserve"> MERGEFIELD  OrderID  \* MERGEFORMAT </w:instrText>
+                  </w:r>
+                  <w:r>
+                    <w:rPr>
+                      <w:sz w:val="18"/>
+                      <w:szCs w:val="18"/>
+                    </w:rPr>
+                    <w:fldChar w:fldCharType="separate"/>
+                  </w:r>
+                  <w:r>
+                    <w:rPr>
+                      <w:noProof/>
+                      <w:sz w:val="18"/>
+                      <w:szCs w:val="18"/>
+                    </w:rPr>
+                    <w:t>«OrderID»</w:t>
+                  </w:r>
+                  <w:r>
+                    <w:rPr>
+                      <w:sz w:val="18"/>
+                      <w:szCs w:val="18"/>
+                    </w:rPr>
+                    <w:fldChar w:fldCharType="end"/>
+                  </w:r>
+                </w:p>
+              </w:tc>
+            </w:tr>
+            <w:tr>
+              <w:tc>
+                <w:tcPr>
+                  <w:tcW w:w="1373" w:type="dxa"/>
+                </w:tcPr>
+                <w:p>
+                  <w:pPr>
+                    <w:pStyle w:val="NoSpacing"/>
+                    <w:jc w:val="right"/>
+                    <w:rPr>
+                      <w:noProof/>
+                      <w:color w:val="7F7F7F" w:themeColor="text1" w:themeTint="80"/>
+                      <w:sz w:val="18"/>
+                      <w:szCs w:val="18"/>
+                    </w:rPr>
+                  </w:pPr>
+                  <w:r>
+                    <w:rPr>
+                      <w:color w:val="7F7F7F" w:themeColor="text1" w:themeTint="80"/>
+                      <w:sz w:val="18"/>
+                      <w:szCs w:val="18"/>
+                    </w:rPr>
+                    <w:t>Attendance</w:t>
+                  </w:r>
+                  <w:r>
+                    <w:rPr>
+                      <w:color w:val="7F7F7F" w:themeColor="text1" w:themeTint="80"/>
+                      <w:sz w:val="18"/>
+                      <w:szCs w:val="18"/>
+                    </w:rPr>
+                    <w:t>:</w:t>
+                  </w:r>
+                </w:p>
+              </w:tc>
+              <w:tc>
+                <w:tcPr>
+                  <w:tcW w:w="1557" w:type="dxa"/>
+                </w:tcPr>
+                <w:p>
+                  <w:pPr>
+                    <w:pStyle w:val="NoSpacing"/>
+                    <w:rPr>
+                      <w:noProof/>
+                      <w:sz w:val="18"/>
+                      <w:szCs w:val="18"/>
+                    </w:rPr>
+                  </w:pPr>
+                  <w:r>
+                    <w:rPr>
+                      <w:sz w:val="18"/>
+                      <w:szCs w:val="18"/>
+                    </w:rPr>
+                    <w:fldChar w:fldCharType="begin"/>
+                  </w:r>
+                  <w:r>
+                    <w:rPr>
+                      <w:sz w:val="18"/>
+                      <w:szCs w:val="18"/>
+                    </w:rPr>
+                    <w:instrText xml:space="preserve"> MERGEFIELD  AttendType  \* MERGEFORMAT </w:instrText>
+                  </w:r>
+                  <w:r>
+                    <w:rPr>
+                      <w:sz w:val="18"/>
+                      <w:szCs w:val="18"/>
+                    </w:rPr>
+                    <w:fldChar w:fldCharType="separate"/>
+                  </w:r>
+                  <w:r>
+                    <w:rPr>
+                      <w:noProof/>
+                      <w:sz w:val="18"/>
+                      <w:szCs w:val="18"/>
+                    </w:rPr>
+                    <w:t>«AttendType»</w:t>
+                  </w:r>
+                  <w:r>
+                    <w:rPr>
+                      <w:sz w:val="18"/>
+                      <w:szCs w:val="18"/>
+                    </w:rPr>
+                    <w:fldChar w:fldCharType="end"/>
+                  </w:r>
+                </w:p>
+              </w:tc>
+            </w:tr>
+            <w:tr>
+              <w:tc>
+                <w:tcPr>
+                  <w:tcW w:w="1373" w:type="dxa"/>
+                </w:tcPr>
+                <w:p>
+                  <w:pPr>
+                    <w:pStyle w:val="NoSpacing"/>
+                    <w:jc w:val="right"/>
+                    <w:rPr>
+                      <w:noProof/>
+                      <w:color w:val="7F7F7F" w:themeColor="text1" w:themeTint="80"/>
+                      <w:sz w:val="18"/>
+                      <w:szCs w:val="18"/>
+                    </w:rPr>
+                  </w:pPr>
+                  <w:r>
+                    <w:rPr>
+                      <w:color w:val="7F7F7F" w:themeColor="text1" w:themeTint="80"/>
+                      <w:sz w:val="18"/>
+                      <w:szCs w:val="18"/>
+                    </w:rPr>
+                    <w:t>Status:</w:t>
+                  </w:r>
+                </w:p>
+              </w:tc>
+              <w:tc>
+                <w:tcPr>
+                  <w:tcW w:w="1557" w:type="dxa"/>
+                </w:tcPr>
+                <w:p>
+                  <w:pPr>
+                    <w:pStyle w:val="NoSpacing"/>
+                    <w:rPr>
+                      <w:noProof/>
+                      <w:sz w:val="18"/>
+                      <w:szCs w:val="18"/>
+                    </w:rPr>
+                  </w:pPr>
+                  <w:r>
+                    <w:rPr>
+                      <w:sz w:val="18"/>
+                      <w:szCs w:val="18"/>
+                    </w:rPr>
+                    <w:fldChar w:fldCharType="begin"/>
+                  </w:r>
+                  <w:r>
+                    <w:rPr>
+                      <w:sz w:val="18"/>
+                      <w:szCs w:val="18"/>
+                    </w:rPr>
+                    <w:instrText xml:space="preserve"> MERGEFIELD  PaymentStatus  \* MERGEFORMAT </w:instrText>
+                  </w:r>
+                  <w:r>
+                    <w:rPr>
+                      <w:sz w:val="18"/>
+                      <w:szCs w:val="18"/>
+                    </w:rPr>
+                    <w:fldChar w:fldCharType="separate"/>
+                  </w:r>
+                  <w:r>
+                    <w:rPr>
+                      <w:noProof/>
+                      <w:sz w:val="18"/>
+                      <w:szCs w:val="18"/>
+                    </w:rPr>
+                    <w:t>«PaymentStatus»</w:t>
+                  </w:r>
+                  <w:r>
+                    <w:rPr>
+                      <w:sz w:val="18"/>
+                      <w:szCs w:val="18"/>
+                    </w:rPr>
+                    <w:fldChar w:fldCharType="end"/>
+                  </w:r>
+                </w:p>
+              </w:tc>
+            </w:tr>
+          </w:tbl>
           <w:p>
             <w:pPr>
-              <w:jc w:val="center"/>
               <w:rPr>
                 <w:noProof/>
                 <w:sz w:val="18"/>
                 <w:szCs w:val="18"/>
               </w:rPr>
             </w:pPr>
-            <w:r>
-              <w:rPr>
-                <w:sz w:val="18"/>
-                <w:szCs w:val="18"/>
-              </w:rPr>
-              <w:fldChar w:fldCharType="begin"/>
-            </w:r>
-            <w:r>
-              <w:rPr>
-                <w:sz w:val="18"/>
-                <w:szCs w:val="18"/>
-              </w:rPr>
-              <w:instrText xml:space="preserve"> MERGEFIELD  OrderID  \* MERGEFORMAT </w:instrText>
-            </w:r>
-            <w:r>
-              <w:rPr>
-                <w:sz w:val="18"/>
-                <w:szCs w:val="18"/>
-              </w:rPr>
-              <w:fldChar w:fldCharType="separate"/>
-            </w:r>
-            <w:r>
-              <w:rPr>
-                <w:noProof/>
-                <w:sz w:val="18"/>
-                <w:szCs w:val="18"/>
-              </w:rPr>
-              <w:t>«OrderID»</w:t>
-            </w:r>
-            <w:r>
-              <w:rPr>
-                <w:sz w:val="18"/>
-                <w:szCs w:val="18"/>
-              </w:rPr>
-              <w:fldChar w:fldCharType="end"/>
-            </w:r>
           </w:p>
-          <w:p>
-            <w:pPr>
-              <w:rPr>
-                <w:color w:val="7F7F7F" w:themeColor="text1" w:themeTint="80"/>
-                <w:sz w:val="18"/>
-                <w:szCs w:val="18"/>
-              </w:rPr>
-            </w:pPr>
-            <w:r>
-              <w:rPr>
-                <w:color w:val="7F7F7F" w:themeColor="text1" w:themeTint="80"/>
-                <w:sz w:val="18"/>
-                <w:szCs w:val="18"/>
-              </w:rPr>
-              <w:t>Attendance Type:</w:t>
-            </w:r>
-          </w:p>
-          <w:p>
-            <w:pPr>
-              <w:jc w:val="center"/>
-              <w:rPr>
-                <w:noProof/>
-                <w:sz w:val="18"/>
-                <w:szCs w:val="18"/>
-              </w:rPr>
-            </w:pPr>
-            <w:r>
-              <w:rPr>
-                <w:sz w:val="18"/>
-                <w:szCs w:val="18"/>
-              </w:rPr>
-              <w:fldChar w:fldCharType="begin"/>
-            </w:r>
-            <w:r>
-              <w:rPr>
-                <w:sz w:val="18"/>
-                <w:szCs w:val="18"/>
-              </w:rPr>
-              <w:instrText xml:space="preserve"> MERGEFIELD  AttendType  \* MERGEFORMAT </w:instrText>
-            </w:r>
-            <w:r>
-              <w:rPr>
-                <w:sz w:val="18"/>
-                <w:szCs w:val="18"/>
-              </w:rPr>
-              <w:fldChar w:fldCharType="separate"/>
-            </w:r>
-            <w:r>
-              <w:rPr>
-                <w:noProof/>
-                <w:sz w:val="18"/>
-                <w:szCs w:val="18"/>
-              </w:rPr>
-              <w:t>«AttendType»</w:t>
-            </w:r>
-            <w:r>
-              <w:rPr>
-                <w:sz w:val="18"/>
-                <w:szCs w:val="18"/>
-              </w:rPr>
-              <w:fldChar w:fldCharType="end"/>
-            </w:r>
-          </w:p>
-          <w:p/>
         </w:tc>
         <w:tc>
           <w:tcPr>
@@ -323,8 +495,10 @@
               <w:right w:val="single" w:sz="6" w:space="0" w:color="auto"/>
             </w:tcBorders>
           </w:tcPr>
-          <w:p/>
           <w:p>
+            <w:pPr>
+              <w:spacing w:before="200"/>
+            </w:pPr>
             <w:r>
               <w:t xml:space="preserve">Dear </w:t>
             </w:r>
@@ -340,8 +514,10 @@
               <w:t>,</w:t>
             </w:r>
           </w:p>
-          <w:p/>
           <w:p>
+            <w:pPr>
+              <w:spacing w:before="200"/>
+            </w:pPr>
             <w:r>
               <w:t xml:space="preserve">We hope you enjoyed </w:t>
             </w:r>
@@ -391,18 +567,22 @@
               </w:r>
             </w:fldSimple>
           </w:p>
-          <w:p/>
-          <w:p>
-            <w:r>
-              <w:t>Accessing your recording depends:</w:t>
-            </w:r>
-          </w:p>
           <w:p>
             <w:pPr>
+              <w:spacing w:before="200"/>
               <w:rPr>
                 <w:noProof/>
               </w:rPr>
             </w:pPr>
+            <w:r>
+              <w:t>How To Access Your Recording</w:t>
+            </w:r>
+            <w:r>
+              <w:t>:</w:t>
+            </w:r>
+            <w:r>
+              <w:br/>
+            </w:r>
             <w:r>
               <w:rPr>
                 <w:b/>
@@ -422,6 +602,12 @@
               </w:r>
             </w:fldSimple>
             <w:r>
+              <w:rPr>
+                <w:noProof/>
+              </w:rPr>
+              <w:t xml:space="preserve"> -</w:t>
+            </w:r>
+            <w:r>
               <w:t xml:space="preserve"> you can log into your account </w:t>
             </w:r>
             <w:r>
@@ -431,7 +617,10 @@
               <w:t>ac</w:t>
             </w:r>
             <w:r>
-              <w:t>cess to the full details of you</w:t>
+              <w:t>cess the full details of you</w:t>
+            </w:r>
+            <w:r>
+              <w:t>r order</w:t>
             </w:r>
             <w:r>
               <w:t xml:space="preserve">. </w:t>
@@ -445,17 +634,35 @@
               </w:r>
             </w:fldSimple>
           </w:p>
-          <w:p/>
           <w:p>
+            <w:pPr>
+              <w:spacing w:before="200"/>
+            </w:pPr>
             <w:r>
               <w:rPr>
                 <w:b/>
                 <w:i/>
               </w:rPr>
-              <w:t>If this message is forwarded to you</w:t>
-            </w:r>
-            <w:r>
-              <w:t xml:space="preserve"> by the original registrant (see above),  you may access the content by visiting the link below. No password will be required but you will be prompted for name and email. </w:t>
+              <w:t>If you</w:t>
+            </w:r>
+            <w:r>
+              <w:rPr>
+                <w:b/>
+                <w:i/>
+              </w:rPr>
+              <w:t xml:space="preserve"> are not the original registrant</w:t>
+            </w:r>
+            <w:r>
+              <w:t xml:space="preserve"> -</w:t>
+            </w:r>
+            <w:r>
+              <w:t xml:space="preserve"> you </w:t>
+            </w:r>
+            <w:r>
+              <w:t xml:space="preserve">can </w:t>
+            </w:r>
+            <w:r>
+              <w:t xml:space="preserve">access the content by visiting the link below. No password will be required but you will be prompted for name and email. </w:t>
             </w:r>
             <w:fldSimple w:instr=" MERGEFIELD  OndemandLink  \* MERGEFORMAT ">
               <w:r>
@@ -469,14 +676,34 @@
               <w:t>.</w:t>
             </w:r>
           </w:p>
-          <w:p/>
           <w:p>
+            <w:pPr>
+              <w:spacing w:before="200"/>
+              <w:rPr>
+                <w:noProof/>
+              </w:rPr>
+            </w:pPr>
+            <w:fldSimple w:instr=" MERGEFIELD  PaymentCaption  \* MERGEFORMAT ">
+              <w:r>
+                <w:rPr>
+                  <w:noProof/>
+                </w:rPr>
+                <w:t>«PaymentCaption»</w:t>
+              </w:r>
+            </w:fldSimple>
+          </w:p>
+          <w:p>
+            <w:pPr>
+              <w:spacing w:before="200"/>
+            </w:pPr>
             <w:r>
               <w:t>It is possible that clicking the link directly within the email is prevented by your network’s policies. Pasting the above address into your browser’s window might work better.</w:t>
             </w:r>
           </w:p>
-          <w:p/>
           <w:p>
+            <w:pPr>
+              <w:spacing w:before="200"/>
+            </w:pPr>
             <w:r>
               <w:t xml:space="preserve">The customer service staff at </w:t>
             </w:r>
@@ -559,10 +786,7 @@
             <w:gridSpan w:val="4"/>
             <w:shd w:val="clear" w:color="auto" w:fill="4D677F"/>
           </w:tcPr>
-          <w:p>
-            <w:bookmarkStart w:id="0" w:name="_GoBack"/>
-            <w:bookmarkEnd w:id="0"/>
-          </w:p>
+          <w:p/>
         </w:tc>
       </w:tr>
     </w:tbl>
@@ -1055,6 +1279,15 @@
       </w:tblBorders>
     </w:tblPr>
   </w:style>
+  <w:style w:type="paragraph" w:styleId="NoSpacing">
+    <w:name w:val="No Spacing"/>
+    <w:uiPriority w:val="1"/>
+    <w:qFormat/>
+    <w:rsid w:val="008C6DB1"/>
+    <w:pPr>
+      <w:spacing w:after="0" w:line="240" w:lineRule="auto"/>
+    </w:pPr>
+  </w:style>
 </w:styles>
 </file>
 
@@ -1324,7 +1557,7 @@
 </file>
 
 <file path=customXml/itemProps1.xml><?xml version="1.0" encoding="utf-8"?>
-<ds:datastoreItem xmlns:ds="http://schemas.openxmlformats.org/officeDocument/2006/customXml" ds:itemID="{1D4D1E5E-6873-4BA0-BE64-C782B4629B14}">
+<ds:datastoreItem xmlns:ds="http://schemas.openxmlformats.org/officeDocument/2006/customXml" ds:itemID="{2CB93F1C-455C-4682-B8A8-FDCB6CC740B5}">
   <ds:schemaRefs>
     <ds:schemaRef ds:uri="http://schemas.openxmlformats.org/officeDocument/2006/bibliography"/>
   </ds:schemaRefs>

</xml_diff>

<commit_message>
Fixed Aff updater Wraps TRY higher for OnDemand nulls Add Email To Billing handler. Still needs messaging. Stubs UpdateOrder for re-invoiced orders Cleaned old comments
</commit_message>
<xml_diff>
--- a/CUWebinars.Web/App_Data/mergeTemplates/RecordingIsPostedToExistingUserBW.docx
+++ b/CUWebinars.Web/App_Data/mergeTemplates/RecordingIsPostedToExistingUserBW.docx
@@ -537,27 +537,14 @@
             <w:r>
               <w:t xml:space="preserve">Dear </w:t>
             </w:r>
-            <w:r>
-              <w:fldChar w:fldCharType="begin"/>
-            </w:r>
-            <w:r>
-              <w:instrText xml:space="preserve"> MERGEFIELD  FirstName  \* MERGEFORMAT </w:instrText>
-            </w:r>
-            <w:r>
-              <w:fldChar w:fldCharType="separate"/>
-            </w:r>
-            <w:r>
-              <w:rPr>
-                <w:noProof/>
-              </w:rPr>
-              <w:t>«FirstName»</w:t>
-            </w:r>
-            <w:r>
-              <w:rPr>
-                <w:noProof/>
-              </w:rPr>
-              <w:fldChar w:fldCharType="end"/>
-            </w:r>
+            <w:fldSimple w:instr=" MERGEFIELD  FirstName  \* MERGEFORMAT ">
+              <w:r>
+                <w:rPr>
+                  <w:noProof/>
+                </w:rPr>
+                <w:t>«FirstName»</w:t>
+              </w:r>
+            </w:fldSimple>
             <w:r>
               <w:t>,</w:t>
             </w:r>
@@ -606,27 +593,14 @@
             <w:r>
               <w:t xml:space="preserve"> </w:t>
             </w:r>
-            <w:r>
-              <w:fldChar w:fldCharType="begin"/>
-            </w:r>
-            <w:r>
-              <w:instrText xml:space="preserve"> MERGEFIELD  RegDesc  \* MERGEFORMAT </w:instrText>
-            </w:r>
-            <w:r>
-              <w:fldChar w:fldCharType="separate"/>
-            </w:r>
-            <w:r>
-              <w:rPr>
-                <w:noProof/>
-              </w:rPr>
-              <w:t>«RegDesc»</w:t>
-            </w:r>
-            <w:r>
-              <w:rPr>
-                <w:noProof/>
-              </w:rPr>
-              <w:fldChar w:fldCharType="end"/>
-            </w:r>
+            <w:fldSimple w:instr=" MERGEFIELD  RegDesc  \* MERGEFORMAT ">
+              <w:r>
+                <w:rPr>
+                  <w:noProof/>
+                </w:rPr>
+                <w:t>«RegDesc»</w:t>
+              </w:r>
+            </w:fldSimple>
           </w:p>
           <w:p>
             <w:pPr>
@@ -654,31 +628,18 @@
             <w:r>
               <w:t xml:space="preserve"> – if your email is </w:t>
             </w:r>
-            <w:r>
-              <w:fldChar w:fldCharType="begin"/>
-            </w:r>
-            <w:r>
-              <w:instrText xml:space="preserve"> MERGEFIELD  BillingEmail  \* MERGEFORMAT </w:instrText>
-            </w:r>
-            <w:r>
-              <w:fldChar w:fldCharType="separate"/>
-            </w:r>
+            <w:fldSimple w:instr=" MERGEFIELD  BillingEmail  \* MERGEFORMAT ">
+              <w:r>
+                <w:rPr>
+                  <w:noProof/>
+                </w:rPr>
+                <w:t>«BillingEmail»</w:t>
+              </w:r>
+            </w:fldSimple>
             <w:r>
               <w:rPr>
                 <w:noProof/>
               </w:rPr>
-              <w:t>«BillingEmail»</w:t>
-            </w:r>
-            <w:r>
-              <w:rPr>
-                <w:noProof/>
-              </w:rPr>
-              <w:fldChar w:fldCharType="end"/>
-            </w:r>
-            <w:r>
-              <w:rPr>
-                <w:noProof/>
-              </w:rPr>
               <w:t xml:space="preserve"> -</w:t>
             </w:r>
             <w:r>
@@ -699,27 +660,14 @@
             <w:r>
               <w:t xml:space="preserve">. </w:t>
             </w:r>
-            <w:r>
-              <w:fldChar w:fldCharType="begin"/>
-            </w:r>
-            <w:r>
-              <w:instrText xml:space="preserve"> MERGEFIELD  LinkToMyWebinars  \* MERGEFORMAT </w:instrText>
-            </w:r>
-            <w:r>
-              <w:fldChar w:fldCharType="separate"/>
-            </w:r>
-            <w:r>
-              <w:rPr>
-                <w:noProof/>
-              </w:rPr>
-              <w:t>«LinkToMyWebinars»</w:t>
-            </w:r>
-            <w:r>
-              <w:rPr>
-                <w:noProof/>
-              </w:rPr>
-              <w:fldChar w:fldCharType="end"/>
-            </w:r>
+            <w:fldSimple w:instr=" MERGEFIELD  LinkToMyWebinars  \* MERGEFORMAT ">
+              <w:r>
+                <w:rPr>
+                  <w:noProof/>
+                </w:rPr>
+                <w:t>«LinkToMyWebinars»</w:t>
+              </w:r>
+            </w:fldSimple>
           </w:p>
           <w:p>
             <w:pPr>
@@ -754,32 +702,17 @@
             <w:r>
               <w:t xml:space="preserve">ing the link below. No password </w:t>
             </w:r>
-            <w:bookmarkStart w:id="0" w:name="_GoBack"/>
-            <w:bookmarkEnd w:id="0"/>
             <w:r>
               <w:t xml:space="preserve">required but you will be prompted for name and email. </w:t>
             </w:r>
-            <w:r>
-              <w:fldChar w:fldCharType="begin"/>
-            </w:r>
-            <w:r>
-              <w:instrText xml:space="preserve"> MERGEFIELD  OndemandLink  \* MERGEFORMAT </w:instrText>
-            </w:r>
-            <w:r>
-              <w:fldChar w:fldCharType="separate"/>
-            </w:r>
-            <w:r>
-              <w:rPr>
-                <w:noProof/>
-              </w:rPr>
-              <w:t>«OndemandLink»</w:t>
-            </w:r>
-            <w:r>
-              <w:rPr>
-                <w:noProof/>
-              </w:rPr>
-              <w:fldChar w:fldCharType="end"/>
-            </w:r>
+            <w:fldSimple w:instr=" MERGEFIELD  OndemandLink  \* MERGEFORMAT ">
+              <w:r>
+                <w:rPr>
+                  <w:noProof/>
+                </w:rPr>
+                <w:t>«OndemandLink»</w:t>
+              </w:r>
+            </w:fldSimple>
             <w:r>
               <w:t>.</w:t>
             </w:r>
@@ -791,27 +724,14 @@
                 <w:noProof/>
               </w:rPr>
             </w:pPr>
-            <w:r>
-              <w:fldChar w:fldCharType="begin"/>
-            </w:r>
-            <w:r>
-              <w:instrText xml:space="preserve"> MERGEFIELD  PaymentCaption  \* MERGEFORMAT </w:instrText>
-            </w:r>
-            <w:r>
-              <w:fldChar w:fldCharType="separate"/>
-            </w:r>
-            <w:r>
-              <w:rPr>
-                <w:noProof/>
-              </w:rPr>
-              <w:t>«PaymentCaption»</w:t>
-            </w:r>
-            <w:r>
-              <w:rPr>
-                <w:noProof/>
-              </w:rPr>
-              <w:fldChar w:fldCharType="end"/>
-            </w:r>
+            <w:fldSimple w:instr=" MERGEFIELD  PaymentCaption  \* MERGEFORMAT ">
+              <w:r>
+                <w:rPr>
+                  <w:noProof/>
+                </w:rPr>
+                <w:t>«PaymentCaption»</w:t>
+              </w:r>
+            </w:fldSimple>
           </w:p>
           <w:p>
             <w:pPr>
@@ -828,11 +748,40 @@
             <w:r>
               <w:t xml:space="preserve">The customer service staff at </w:t>
             </w:r>
+            <w:fldSimple w:instr=" MERGEFIELD  TenantName  \* MERGEFORMAT ">
+              <w:r>
+                <w:rPr>
+                  <w:noProof/>
+                </w:rPr>
+                <w:t>«TenantName»</w:t>
+              </w:r>
+            </w:fldSimple>
+            <w:r>
+              <w:t xml:space="preserve"> is confident you’ll find both </w:t>
+            </w:r>
+            <w:r>
+              <w:t xml:space="preserve">our Webinars and </w:t>
+            </w:r>
+            <w:r>
+              <w:t xml:space="preserve">our site’s ability to deliver that </w:t>
+            </w:r>
+            <w:r>
+              <w:t>content</w:t>
+            </w:r>
+            <w:r>
+              <w:t xml:space="preserve"> meets the highest standards in the industry. And in the off chance it doesn’t, please</w:t>
+            </w:r>
+            <w:r>
+              <w:t xml:space="preserve"> email us</w:t>
+            </w:r>
+            <w:r>
+              <w:t xml:space="preserve"> (</w:t>
+            </w:r>
             <w:r>
               <w:fldChar w:fldCharType="begin"/>
             </w:r>
             <w:r>
-              <w:instrText xml:space="preserve"> MERGEFIELD  TenantName  \* MERGEFORMAT </w:instrText>
+              <w:instrText xml:space="preserve"> MERGEFIELD  SupportEmail  \* MERGEFORMAT </w:instrText>
             </w:r>
             <w:r>
               <w:fldChar w:fldCharType="separate"/>
@@ -841,49 +790,35 @@
               <w:rPr>
                 <w:noProof/>
               </w:rPr>
-              <w:t>«TenantName»</w:t>
-            </w:r>
+              <w:t>«</w:t>
+            </w:r>
+            <w:proofErr w:type="spellStart"/>
             <w:r>
               <w:rPr>
                 <w:noProof/>
               </w:rPr>
+              <w:t>SupportEmail</w:t>
+            </w:r>
+            <w:proofErr w:type="spellEnd"/>
+            <w:r>
+              <w:rPr>
+                <w:noProof/>
+              </w:rPr>
+              <w:t>»</w:t>
+            </w:r>
+            <w:r>
               <w:fldChar w:fldCharType="end"/>
             </w:r>
             <w:r>
-              <w:t xml:space="preserve"> is confident you’ll find both </w:t>
-            </w:r>
-            <w:r>
-              <w:t xml:space="preserve">our Webinars and </w:t>
-            </w:r>
-            <w:r>
-              <w:t xml:space="preserve">our site’s ability to deliver that </w:t>
-            </w:r>
-            <w:r>
-              <w:t>content</w:t>
-            </w:r>
-            <w:r>
-              <w:t xml:space="preserve"> meets the highest standards in the industry. And in the off chance it doesn’t, please visit our online chat where you’ll find a professional representative waiting to make sure your satisfaction is restored. </w:t>
-            </w:r>
-            <w:r>
-              <w:fldChar w:fldCharType="begin"/>
-            </w:r>
-            <w:r>
-              <w:instrText xml:space="preserve"> MERGEFIELD  TechSupportLink  \* MERGEFORMAT </w:instrText>
-            </w:r>
-            <w:r>
-              <w:fldChar w:fldCharType="separate"/>
-            </w:r>
-            <w:r>
-              <w:rPr>
-                <w:noProof/>
-              </w:rPr>
-              <w:t>«TechSupportLink»</w:t>
-            </w:r>
-            <w:r>
-              <w:rPr>
-                <w:noProof/>
-              </w:rPr>
-              <w:fldChar w:fldCharType="end"/>
+              <w:t>) or</w:t>
+            </w:r>
+            <w:bookmarkStart w:id="0" w:name="_GoBack"/>
+            <w:bookmarkEnd w:id="0"/>
+            <w:r>
+              <w:t xml:space="preserve"> visit our online chat where you’ll find a professional representative waiting to make sur</w:t>
+            </w:r>
+            <w:r>
+              <w:t>e your satisfaction is restored</w:t>
             </w:r>
             <w:r>
               <w:t>.</w:t>
@@ -1704,7 +1639,7 @@
 </file>
 
 <file path=customXml/itemProps1.xml><?xml version="1.0" encoding="utf-8"?>
-<ds:datastoreItem xmlns:ds="http://schemas.openxmlformats.org/officeDocument/2006/customXml" ds:itemID="{A188EBC7-72FD-4077-8DB6-BFD8FCFECD3D}">
+<ds:datastoreItem xmlns:ds="http://schemas.openxmlformats.org/officeDocument/2006/customXml" ds:itemID="{8B42416F-85C1-43E0-B830-DC4E0DA93C87}">
   <ds:schemaRefs>
     <ds:schemaRef ds:uri="http://schemas.openxmlformats.org/officeDocument/2006/bibliography"/>
   </ds:schemaRefs>

</xml_diff>

<commit_message>
Fixes AddBillingEmail method Updates SendHardcopy checkbox default to 'unchecked'
</commit_message>
<xml_diff>
--- a/CUWebinars.Web/App_Data/mergeTemplates/RecordingIsPostedToExistingUserBW.docx
+++ b/CUWebinars.Web/App_Data/mergeTemplates/RecordingIsPostedToExistingUserBW.docx
@@ -1,6 +1,6 @@
 
 <file path=word/document.xml><?xml version="1.0" encoding="utf-8"?>
-<w:document xmlns:wpc="http://schemas.microsoft.com/office/word/2010/wordprocessingCanvas" xmlns:cx="http://schemas.microsoft.com/office/drawing/2014/chartex" xmlns:cx1="http://schemas.microsoft.com/office/drawing/2015/9/8/chartex" xmlns:cx2="http://schemas.microsoft.com/office/drawing/2015/10/21/chartex" xmlns:cx3="http://schemas.microsoft.com/office/drawing/2016/5/9/chartex" xmlns:cx4="http://schemas.microsoft.com/office/drawing/2016/5/10/chartex" xmlns:cx5="http://schemas.microsoft.com/office/drawing/2016/5/11/chartex" xmlns:mc="http://schemas.openxmlformats.org/markup-compatibility/2006" xmlns:o="urn:schemas-microsoft-com:office:office" xmlns:r="http://schemas.openxmlformats.org/officeDocument/2006/relationships" xmlns:m="http://schemas.openxmlformats.org/officeDocument/2006/math" xmlns:v="urn:schemas-microsoft-com:vml" xmlns:wp14="http://schemas.microsoft.com/office/word/2010/wordprocessingDrawing" xmlns:wp="http://schemas.openxmlformats.org/drawingml/2006/wordprocessingDrawing" xmlns:w10="urn:schemas-microsoft-com:office:word" xmlns:w="http://schemas.openxmlformats.org/wordprocessingml/2006/main" xmlns:w14="http://schemas.microsoft.com/office/word/2010/wordml" xmlns:w15="http://schemas.microsoft.com/office/word/2012/wordml" xmlns:w16se="http://schemas.microsoft.com/office/word/2015/wordml/symex" xmlns:wpg="http://schemas.microsoft.com/office/word/2010/wordprocessingGroup" xmlns:wpi="http://schemas.microsoft.com/office/word/2010/wordprocessingInk" xmlns:wne="http://schemas.microsoft.com/office/word/2006/wordml" xmlns:wps="http://schemas.microsoft.com/office/word/2010/wordprocessingShape" mc:Ignorable="w14 w15 w16se wp14">
+<w:document xmlns:wpc="http://schemas.microsoft.com/office/word/2010/wordprocessingCanvas" xmlns:cx="http://schemas.microsoft.com/office/drawing/2014/chartex" xmlns:cx1="http://schemas.microsoft.com/office/drawing/2015/9/8/chartex" xmlns:cx2="http://schemas.microsoft.com/office/drawing/2015/10/21/chartex" xmlns:cx3="http://schemas.microsoft.com/office/drawing/2016/5/9/chartex" xmlns:cx4="http://schemas.microsoft.com/office/drawing/2016/5/10/chartex" xmlns:cx5="http://schemas.microsoft.com/office/drawing/2016/5/11/chartex" xmlns:cx6="http://schemas.microsoft.com/office/drawing/2016/5/12/chartex" xmlns:cx7="http://schemas.microsoft.com/office/drawing/2016/5/13/chartex" xmlns:cx8="http://schemas.microsoft.com/office/drawing/2016/5/14/chartex" xmlns:mc="http://schemas.openxmlformats.org/markup-compatibility/2006" xmlns:aink="http://schemas.microsoft.com/office/drawing/2016/ink" xmlns:am3d="http://schemas.microsoft.com/office/drawing/2017/model3d" xmlns:o="urn:schemas-microsoft-com:office:office" xmlns:r="http://schemas.openxmlformats.org/officeDocument/2006/relationships" xmlns:m="http://schemas.openxmlformats.org/officeDocument/2006/math" xmlns:v="urn:schemas-microsoft-com:vml" xmlns:wp14="http://schemas.microsoft.com/office/word/2010/wordprocessingDrawing" xmlns:wp="http://schemas.openxmlformats.org/drawingml/2006/wordprocessingDrawing" xmlns:w10="urn:schemas-microsoft-com:office:word" xmlns:w="http://schemas.openxmlformats.org/wordprocessingml/2006/main" xmlns:w14="http://schemas.microsoft.com/office/word/2010/wordml" xmlns:w15="http://schemas.microsoft.com/office/word/2012/wordml" xmlns:w16cid="http://schemas.microsoft.com/office/word/2016/wordml/cid" xmlns:w16se="http://schemas.microsoft.com/office/word/2015/wordml/symex" xmlns:wpg="http://schemas.microsoft.com/office/word/2010/wordprocessingGroup" xmlns:wpi="http://schemas.microsoft.com/office/word/2010/wordprocessingInk" xmlns:wne="http://schemas.microsoft.com/office/word/2006/wordml" xmlns:wps="http://schemas.microsoft.com/office/word/2010/wordprocessingShape" mc:Ignorable="w14 w15 w16se w16cid wp14">
   <w:body>
     <w:tbl>
       <w:tblPr>
@@ -537,14 +537,27 @@
             <w:r>
               <w:t xml:space="preserve">Dear </w:t>
             </w:r>
-            <w:fldSimple w:instr=" MERGEFIELD  FirstName  \* MERGEFORMAT ">
-              <w:r>
-                <w:rPr>
-                  <w:noProof/>
-                </w:rPr>
-                <w:t>«FirstName»</w:t>
-              </w:r>
-            </w:fldSimple>
+            <w:r>
+              <w:fldChar w:fldCharType="begin"/>
+            </w:r>
+            <w:r>
+              <w:instrText xml:space="preserve"> MERGEFIELD  FirstName  \* MERGEFORMAT </w:instrText>
+            </w:r>
+            <w:r>
+              <w:fldChar w:fldCharType="separate"/>
+            </w:r>
+            <w:r>
+              <w:rPr>
+                <w:noProof/>
+              </w:rPr>
+              <w:t>«FirstName»</w:t>
+            </w:r>
+            <w:r>
+              <w:rPr>
+                <w:noProof/>
+              </w:rPr>
+              <w:fldChar w:fldCharType="end"/>
+            </w:r>
             <w:r>
               <w:t>,</w:t>
             </w:r>
@@ -554,7 +567,15 @@
               <w:spacing w:before="200"/>
             </w:pPr>
             <w:r>
-              <w:t xml:space="preserve">We hope you enjoyed </w:t>
+              <w:t xml:space="preserve">The recording </w:t>
+            </w:r>
+            <w:r>
+              <w:t>of</w:t>
+            </w:r>
+            <w:bookmarkStart w:id="0" w:name="_GoBack"/>
+            <w:bookmarkEnd w:id="0"/>
+            <w:r>
+              <w:t xml:space="preserve"> </w:t>
             </w:r>
             <w:r>
               <w:rPr>
@@ -588,19 +609,32 @@
               <w:fldChar w:fldCharType="end"/>
             </w:r>
             <w:r>
-              <w:t>.</w:t>
+              <w:t xml:space="preserve"> is ready to view!</w:t>
             </w:r>
             <w:r>
               <w:t xml:space="preserve"> </w:t>
             </w:r>
-            <w:fldSimple w:instr=" MERGEFIELD  RegDesc  \* MERGEFORMAT ">
-              <w:r>
-                <w:rPr>
-                  <w:noProof/>
-                </w:rPr>
-                <w:t>«RegDesc»</w:t>
-              </w:r>
-            </w:fldSimple>
+            <w:r>
+              <w:fldChar w:fldCharType="begin"/>
+            </w:r>
+            <w:r>
+              <w:instrText xml:space="preserve"> MERGEFIELD  RegDesc  \* MERGEFORMAT </w:instrText>
+            </w:r>
+            <w:r>
+              <w:fldChar w:fldCharType="separate"/>
+            </w:r>
+            <w:r>
+              <w:rPr>
+                <w:noProof/>
+              </w:rPr>
+              <w:t>«RegDesc»</w:t>
+            </w:r>
+            <w:r>
+              <w:rPr>
+                <w:noProof/>
+              </w:rPr>
+              <w:fldChar w:fldCharType="end"/>
+            </w:r>
           </w:p>
           <w:p>
             <w:pPr>
@@ -634,18 +668,31 @@
             <w:r>
               <w:t xml:space="preserve"> </w:t>
             </w:r>
-            <w:fldSimple w:instr=" MERGEFIELD  BillingEmail  \* MERGEFORMAT ">
-              <w:r>
-                <w:rPr>
-                  <w:noProof/>
-                </w:rPr>
-                <w:t>«BillingEmail»</w:t>
-              </w:r>
-            </w:fldSimple>
+            <w:r>
+              <w:fldChar w:fldCharType="begin"/>
+            </w:r>
+            <w:r>
+              <w:instrText xml:space="preserve"> MERGEFIELD  BillingEmail  \* MERGEFORMAT </w:instrText>
+            </w:r>
+            <w:r>
+              <w:fldChar w:fldCharType="separate"/>
+            </w:r>
             <w:r>
               <w:rPr>
                 <w:noProof/>
               </w:rPr>
+              <w:t>«BillingEmail»</w:t>
+            </w:r>
+            <w:r>
+              <w:rPr>
+                <w:noProof/>
+              </w:rPr>
+              <w:fldChar w:fldCharType="end"/>
+            </w:r>
+            <w:r>
+              <w:rPr>
+                <w:noProof/>
+              </w:rPr>
               <w:t xml:space="preserve"> </w:t>
             </w:r>
             <w:r>
@@ -672,14 +719,27 @@
             <w:r>
               <w:t xml:space="preserve">. </w:t>
             </w:r>
-            <w:fldSimple w:instr=" MERGEFIELD  LinkToMyWebinars  \* MERGEFORMAT ">
-              <w:r>
-                <w:rPr>
-                  <w:noProof/>
-                </w:rPr>
-                <w:t>«LinkToMyWebinars»</w:t>
-              </w:r>
-            </w:fldSimple>
+            <w:r>
+              <w:fldChar w:fldCharType="begin"/>
+            </w:r>
+            <w:r>
+              <w:instrText xml:space="preserve"> MERGEFIELD  LinkToMyWebinars  \* MERGEFORMAT </w:instrText>
+            </w:r>
+            <w:r>
+              <w:fldChar w:fldCharType="separate"/>
+            </w:r>
+            <w:r>
+              <w:rPr>
+                <w:noProof/>
+              </w:rPr>
+              <w:t>«LinkToMyWebinars»</w:t>
+            </w:r>
+            <w:r>
+              <w:rPr>
+                <w:noProof/>
+              </w:rPr>
+              <w:fldChar w:fldCharType="end"/>
+            </w:r>
           </w:p>
           <w:p>
             <w:pPr>
@@ -717,33 +777,33 @@
             <w:r>
               <w:t xml:space="preserve">required but you will be prompted for name and email. </w:t>
             </w:r>
-            <w:fldSimple w:instr=" MERGEFIELD  OndemandLink  \* MERGEFORMAT ">
-              <w:r>
-                <w:rPr>
-                  <w:noProof/>
-                </w:rPr>
-                <w:t>«OndemandLink»</w:t>
-              </w:r>
-            </w:fldSimple>
+            <w:r>
+              <w:fldChar w:fldCharType="begin"/>
+            </w:r>
+            <w:r>
+              <w:instrText xml:space="preserve"> MERGEFIELD  OndemandLink  \* MERGEFORMAT </w:instrText>
+            </w:r>
+            <w:r>
+              <w:fldChar w:fldCharType="separate"/>
+            </w:r>
+            <w:r>
+              <w:rPr>
+                <w:noProof/>
+              </w:rPr>
+              <w:t>«OndemandLink»</w:t>
+            </w:r>
+            <w:r>
+              <w:rPr>
+                <w:noProof/>
+              </w:rPr>
+              <w:fldChar w:fldCharType="end"/>
+            </w:r>
             <w:r>
               <w:t>.</w:t>
             </w:r>
-          </w:p>
-          <w:p>
-            <w:pPr>
-              <w:spacing w:before="200"/>
-              <w:rPr>
-                <w:noProof/>
-              </w:rPr>
-            </w:pPr>
-            <w:fldSimple w:instr=" MERGEFIELD  PaymentCaption  \* MERGEFORMAT ">
-              <w:r>
-                <w:rPr>
-                  <w:noProof/>
-                </w:rPr>
-                <w:t>«PaymentCaption»</w:t>
-              </w:r>
-            </w:fldSimple>
+            <w:r>
+              <w:t xml:space="preserve"> </w:t>
+            </w:r>
           </w:p>
           <w:p>
             <w:pPr>
@@ -751,6 +811,38 @@
             </w:pPr>
             <w:r>
               <w:t>It is possible that clicking the link directly within the email is prevented by your network’s policies. Pasting the above address into your browser’s window might work better.</w:t>
+            </w:r>
+          </w:p>
+          <w:p>
+            <w:pPr>
+              <w:spacing w:before="200"/>
+              <w:rPr>
+                <w:noProof/>
+              </w:rPr>
+            </w:pPr>
+            <w:r>
+              <w:fldChar w:fldCharType="begin"/>
+            </w:r>
+            <w:r>
+              <w:instrText xml:space="preserve"> MERGEFIELD </w:instrText>
+            </w:r>
+            <w:r>
+              <w:instrText xml:space="preserve"> PaymentCaption  \* MERGEFORMAT </w:instrText>
+            </w:r>
+            <w:r>
+              <w:fldChar w:fldCharType="separate"/>
+            </w:r>
+            <w:r>
+              <w:rPr>
+                <w:noProof/>
+              </w:rPr>
+              <w:t>«PaymentCaption»</w:t>
+            </w:r>
+            <w:r>
+              <w:rPr>
+                <w:noProof/>
+              </w:rPr>
+              <w:fldChar w:fldCharType="end"/>
             </w:r>
           </w:p>
           <w:p>
@@ -835,8 +927,8 @@
                           <w:right w:val="single" w:sz="4" w:space="0" w:color="auto"/>
                         </w:tcBorders>
                       </w:tcPr>
-                      <w:bookmarkStart w:id="0" w:name="OLE_LINK1"/>
-                      <w:bookmarkStart w:id="1" w:name="OLE_LINK2"/>
+                      <w:bookmarkStart w:id="1" w:name="OLE_LINK1"/>
+                      <w:bookmarkStart w:id="2" w:name="OLE_LINK2"/>
                       <w:p>
                         <w:pPr>
                           <w:jc w:val="center"/>
@@ -887,8 +979,8 @@
                           </w:rPr>
                           <w:fldChar w:fldCharType="end"/>
                         </w:r>
-                        <w:bookmarkEnd w:id="0"/>
                         <w:bookmarkEnd w:id="1"/>
+                        <w:bookmarkEnd w:id="2"/>
                       </w:p>
                     </w:tc>
                     <w:tc>
@@ -1048,10 +1140,7 @@
               </w:tc>
             </w:tr>
           </w:tbl>
-          <w:p>
-            <w:bookmarkStart w:id="2" w:name="_GoBack"/>
-            <w:bookmarkEnd w:id="2"/>
-          </w:p>
+          <w:p/>
         </w:tc>
         <w:tc>
           <w:tcPr>
@@ -1085,7 +1174,7 @@
 </file>
 
 <file path=word/styles.xml><?xml version="1.0" encoding="utf-8"?>
-<w:styles xmlns:mc="http://schemas.openxmlformats.org/markup-compatibility/2006" xmlns:r="http://schemas.openxmlformats.org/officeDocument/2006/relationships" xmlns:w="http://schemas.openxmlformats.org/wordprocessingml/2006/main" xmlns:w14="http://schemas.microsoft.com/office/word/2010/wordml" xmlns:w15="http://schemas.microsoft.com/office/word/2012/wordml" xmlns:w16se="http://schemas.microsoft.com/office/word/2015/wordml/symex" mc:Ignorable="w14 w15 w16se">
+<w:styles xmlns:mc="http://schemas.openxmlformats.org/markup-compatibility/2006" xmlns:r="http://schemas.openxmlformats.org/officeDocument/2006/relationships" xmlns:w="http://schemas.openxmlformats.org/wordprocessingml/2006/main" xmlns:w14="http://schemas.microsoft.com/office/word/2010/wordml" xmlns:w15="http://schemas.microsoft.com/office/word/2012/wordml" xmlns:w16cid="http://schemas.microsoft.com/office/word/2016/wordml/cid" xmlns:w16se="http://schemas.microsoft.com/office/word/2015/wordml/symex" mc:Ignorable="w14 w15 w16se w16cid">
   <w:docDefaults>
     <w:rPrDefault>
       <w:rPr>
@@ -1101,7 +1190,7 @@
       </w:pPr>
     </w:pPrDefault>
   </w:docDefaults>
-  <w:latentStyles w:defLockedState="0" w:defUIPriority="99" w:defSemiHidden="0" w:defUnhideWhenUsed="0" w:defQFormat="0" w:count="374">
+  <w:latentStyles w:defLockedState="0" w:defUIPriority="99" w:defSemiHidden="0" w:defUnhideWhenUsed="0" w:defQFormat="0" w:count="375">
     <w:lsdException w:name="Normal" w:uiPriority="0" w:qFormat="1"/>
     <w:lsdException w:name="heading 1" w:uiPriority="9" w:qFormat="1"/>
     <w:lsdException w:name="heading 2" w:semiHidden="1" w:uiPriority="9" w:unhideWhenUsed="1" w:qFormat="1"/>
@@ -1207,7 +1296,6 @@
     <w:lsdException w:name="HTML Sample" w:semiHidden="1" w:unhideWhenUsed="1"/>
     <w:lsdException w:name="HTML Typewriter" w:semiHidden="1" w:unhideWhenUsed="1"/>
     <w:lsdException w:name="HTML Variable" w:semiHidden="1" w:unhideWhenUsed="1"/>
-    <w:lsdException w:name="Normal Table" w:semiHidden="1" w:unhideWhenUsed="1"/>
     <w:lsdException w:name="annotation subject" w:semiHidden="1" w:unhideWhenUsed="1"/>
     <w:lsdException w:name="No List" w:semiHidden="1" w:unhideWhenUsed="1"/>
     <w:lsdException w:name="Outline List 1" w:semiHidden="1" w:unhideWhenUsed="1"/>
@@ -1254,10 +1342,8 @@
     <w:lsdException w:name="Table Subtle 2" w:semiHidden="1" w:unhideWhenUsed="1"/>
     <w:lsdException w:name="Table Web 1" w:semiHidden="1" w:unhideWhenUsed="1"/>
     <w:lsdException w:name="Table Web 2" w:semiHidden="1" w:unhideWhenUsed="1"/>
-    <w:lsdException w:name="Table Web 3" w:semiHidden="1" w:unhideWhenUsed="1"/>
     <w:lsdException w:name="Balloon Text" w:semiHidden="1" w:unhideWhenUsed="1"/>
     <w:lsdException w:name="Table Grid" w:uiPriority="39"/>
-    <w:lsdException w:name="Table Theme" w:semiHidden="1" w:unhideWhenUsed="1"/>
     <w:lsdException w:name="Placeholder Text" w:semiHidden="1"/>
     <w:lsdException w:name="No Spacing" w:uiPriority="1" w:qFormat="1"/>
     <w:lsdException w:name="Light Shading" w:uiPriority="60"/>
@@ -1476,6 +1562,7 @@
     <w:lsdException w:name="Mention" w:semiHidden="1" w:unhideWhenUsed="1"/>
     <w:lsdException w:name="Smart Hyperlink" w:semiHidden="1" w:unhideWhenUsed="1"/>
     <w:lsdException w:name="Hashtag" w:semiHidden="1" w:unhideWhenUsed="1"/>
+    <w:lsdException w:name="Unresolved Mention" w:semiHidden="1" w:unhideWhenUsed="1"/>
   </w:latentStyles>
   <w:style w:type="paragraph" w:default="1" w:styleId="Normal">
     <w:name w:val="Normal"/>
@@ -1835,21 +1922,6 @@
 </file>
 
 <file path=customXml/item1.xml><?xml version="1.0" encoding="utf-8"?>
-<p:properties xmlns:p="http://schemas.microsoft.com/office/2006/metadata/properties" xmlns:xsi="http://www.w3.org/2001/XMLSchema-instance" xmlns:pc="http://schemas.microsoft.com/office/infopath/2007/PartnerControls">
-  <documentManagement/>
-</p:properties>
-</file>
-
-<file path=customXml/item2.xml><?xml version="1.0" encoding="utf-8"?>
-<?mso-contentType ?>
-<FormTemplates xmlns="http://schemas.microsoft.com/sharepoint/v3/contenttype/forms">
-  <Display>DocumentLibraryForm</Display>
-  <Edit>DocumentLibraryForm</Edit>
-  <New>DocumentLibraryForm</New>
-</FormTemplates>
-</file>
-
-<file path=customXml/item3.xml><?xml version="1.0" encoding="utf-8"?>
 <ct:contentTypeSchema xmlns:ct="http://schemas.microsoft.com/office/2006/metadata/contentType" xmlns:ma="http://schemas.microsoft.com/office/2006/metadata/properties/metaAttributes" ct:_="" ma:_="" ma:contentTypeName="Document" ma:contentTypeID="0x0101001F790F750B123C469E5BE2A9EB6D9D99" ma:contentTypeVersion="5" ma:contentTypeDescription="Create a new document." ma:contentTypeScope="" ma:versionID="d5506308d6bf7227f7ec554c4f76cef4">
   <xsd:schema xmlns:xsd="http://www.w3.org/2001/XMLSchema" xmlns:xs="http://www.w3.org/2001/XMLSchema" xmlns:p="http://schemas.microsoft.com/office/2006/metadata/properties" xmlns:ns2="92e85379-ec43-4192-8d26-0c9c1113fbaf" targetNamespace="http://schemas.microsoft.com/office/2006/metadata/properties" ma:root="true" ma:fieldsID="eeae2fc0e0cc93f015230f549111e05d" ns2:_="">
     <xsd:import namespace="92e85379-ec43-4192-8d26-0c9c1113fbaf"/>
@@ -2017,28 +2089,26 @@
 </ct:contentTypeSchema>
 </file>
 
+<file path=customXml/item2.xml><?xml version="1.0" encoding="utf-8"?>
+<?mso-contentType ?>
+<FormTemplates xmlns="http://schemas.microsoft.com/sharepoint/v3/contenttype/forms">
+  <Display>DocumentLibraryForm</Display>
+  <Edit>DocumentLibraryForm</Edit>
+  <New>DocumentLibraryForm</New>
+</FormTemplates>
+</file>
+
+<file path=customXml/item3.xml><?xml version="1.0" encoding="utf-8"?>
+<p:properties xmlns:p="http://schemas.microsoft.com/office/2006/metadata/properties" xmlns:xsi="http://www.w3.org/2001/XMLSchema-instance" xmlns:pc="http://schemas.microsoft.com/office/infopath/2007/PartnerControls">
+  <documentManagement/>
+</p:properties>
+</file>
+
 <file path=customXml/item4.xml><?xml version="1.0" encoding="utf-8"?>
 <b:Sources xmlns:b="http://schemas.openxmlformats.org/officeDocument/2006/bibliography" xmlns="http://schemas.openxmlformats.org/officeDocument/2006/bibliography" SelectedStyle="\APASixthEditionOfficeOnline.xsl" StyleName="APA" Version="6"/>
 </file>
 
 <file path=customXml/itemProps1.xml><?xml version="1.0" encoding="utf-8"?>
-<ds:datastoreItem xmlns:ds="http://schemas.openxmlformats.org/officeDocument/2006/customXml" ds:itemID="{E289B5C0-0919-49CD-AAA6-177DBA4BD1D0}">
-  <ds:schemaRefs>
-    <ds:schemaRef ds:uri="http://schemas.microsoft.com/office/2006/metadata/properties"/>
-    <ds:schemaRef ds:uri="http://schemas.microsoft.com/office/infopath/2007/PartnerControls"/>
-  </ds:schemaRefs>
-</ds:datastoreItem>
-</file>
-
-<file path=customXml/itemProps2.xml><?xml version="1.0" encoding="utf-8"?>
-<ds:datastoreItem xmlns:ds="http://schemas.openxmlformats.org/officeDocument/2006/customXml" ds:itemID="{890576DF-815A-4CE0-8073-F56BFF5F29B9}">
-  <ds:schemaRefs>
-    <ds:schemaRef ds:uri="http://schemas.microsoft.com/sharepoint/v3/contenttype/forms"/>
-  </ds:schemaRefs>
-</ds:datastoreItem>
-</file>
-
-<file path=customXml/itemProps3.xml><?xml version="1.0" encoding="utf-8"?>
 <ds:datastoreItem xmlns:ds="http://schemas.openxmlformats.org/officeDocument/2006/customXml" ds:itemID="{BA9B4F17-5B3A-40FB-B893-D647F6CD7BCE}">
   <ds:schemaRefs>
     <ds:schemaRef ds:uri="http://schemas.microsoft.com/office/2006/metadata/contentType"/>
@@ -2056,8 +2126,25 @@
 </ds:datastoreItem>
 </file>
 
+<file path=customXml/itemProps2.xml><?xml version="1.0" encoding="utf-8"?>
+<ds:datastoreItem xmlns:ds="http://schemas.openxmlformats.org/officeDocument/2006/customXml" ds:itemID="{890576DF-815A-4CE0-8073-F56BFF5F29B9}">
+  <ds:schemaRefs>
+    <ds:schemaRef ds:uri="http://schemas.microsoft.com/sharepoint/v3/contenttype/forms"/>
+  </ds:schemaRefs>
+</ds:datastoreItem>
+</file>
+
+<file path=customXml/itemProps3.xml><?xml version="1.0" encoding="utf-8"?>
+<ds:datastoreItem xmlns:ds="http://schemas.openxmlformats.org/officeDocument/2006/customXml" ds:itemID="{E289B5C0-0919-49CD-AAA6-177DBA4BD1D0}">
+  <ds:schemaRefs>
+    <ds:schemaRef ds:uri="http://schemas.microsoft.com/office/2006/metadata/properties"/>
+    <ds:schemaRef ds:uri="http://schemas.microsoft.com/office/infopath/2007/PartnerControls"/>
+  </ds:schemaRefs>
+</ds:datastoreItem>
+</file>
+
 <file path=customXml/itemProps4.xml><?xml version="1.0" encoding="utf-8"?>
-<ds:datastoreItem xmlns:ds="http://schemas.openxmlformats.org/officeDocument/2006/customXml" ds:itemID="{CD238F41-917A-49E9-B0A6-2E486B789F87}">
+<ds:datastoreItem xmlns:ds="http://schemas.openxmlformats.org/officeDocument/2006/customXml" ds:itemID="{09459745-F0F4-4ED7-98A4-AD2554342D9D}">
   <ds:schemaRefs>
     <ds:schemaRef ds:uri="http://schemas.openxmlformats.org/officeDocument/2006/bibliography"/>
   </ds:schemaRefs>

</xml_diff>